<commit_message>
new changes as per template
</commit_message>
<xml_diff>
--- a/backend/templates/Address mismatch affidavit-.docx
+++ b/backend/templates/Address mismatch affidavit-.docx
@@ -433,8 +433,6 @@
               </w:rPr>
               <w:t>[Old Address C1]</w:t>
             </w:r>
-            <w:bookmarkStart w:id="0" w:name="_GoBack"/>
-            <w:bookmarkEnd w:id="0"/>
           </w:p>
         </w:tc>
         <w:tc>
@@ -956,8 +954,10 @@
         <w:rPr>
           <w:rFonts w:ascii="Calibri" w:hAnsi="Calibri" w:cs="Calibri"/>
         </w:rPr>
-        <w:t>2025</w:t>
-      </w:r>
+        <w:t>2026</w:t>
+      </w:r>
+      <w:bookmarkStart w:id="0" w:name="_GoBack"/>
+      <w:bookmarkEnd w:id="0"/>
       <w:r>
         <w:rPr>
           <w:rFonts w:ascii="Calibri" w:hAnsi="Calibri" w:cs="Calibri"/>

</xml_diff>